<commit_message>
Fixing some error and problems
</commit_message>
<xml_diff>
--- a/backend/Milestone4_Tadreeb_Filled.docx
+++ b/backend/Milestone4_Tadreeb_Filled.docx
@@ -422,7 +422,7 @@
     </w:p>
     <w:p>
       <w:r>
-        <w:t>Tadreeb is a web-based platform that connects university students with companies offering co-op and internship training programs. The backend API is built with Node.js and Express, connected to a MongoDB database via Mongoose. It exposes a RESTful HTTP API that handles: (1) student self-registration and authentication, (2) company login and opportunity management, (3) student application submission and status tracking, and (4) administrative control over users and company approval workflows. All business logic, input validation, and role-based access control are enforced server-side. The server runs on port 5001 and prefixes every route with /api.</w:t>
+        <w:t>Tadreeb is a web-based platform that connects university students with companies offering co-op and internship training programs. The backend API is built with Node.js and Express, connected to a MongoDB database via Mongoose. It exposes a RESTful HTTP API that handles: (1) student self-registration and authentication, (2) company login and opportunity management, (3) student application submission and status tracking, (4) administrative control over users and company approval workflows, and (5) a public company join-request form allowing companies to apply to the platform before an admin creates their login account. All input validation is centralised in validators.js (email regex, password strength, ObjectId checks). The server enforces Content-Type: application/json on all write requests, returns clean JSON 404s for unknown /api routes, uses a central error handler for Mongoose errors and bad JSON, and validates JWT_SECRET on startup. Server runs on port 5001; all routes are prefixed /api.</w:t>
       </w:r>
     </w:p>
     <w:p>
@@ -3808,6 +3808,346 @@
     <w:p/>
     <w:p/>
     <w:p/>
+    <w:p/>
+    <w:p>
+      <w:r>
+        <w:rPr>
+          <w:b/>
+          <w:i w:val="0"/>
+          <w:color w:val="0F3460"/>
+          <w:sz w:val="24"/>
+        </w:rPr>
+        <w:t>COMPANY REQUEST ROUTE — /api/company-requests</w:t>
+      </w:r>
+    </w:p>
+    <w:p>
+      <w:r>
+        <w:rPr>
+          <w:b/>
+          <w:i w:val="0"/>
+          <w:sz w:val="22"/>
+        </w:rPr>
+        <w:t>Endpoint: Submit Company Join Request</w:t>
+      </w:r>
+    </w:p>
+    <w:p>
+      <w:r>
+        <w:rPr>
+          <w:b/>
+        </w:rPr>
+        <w:t xml:space="preserve">Method: </w:t>
+      </w:r>
+      <w:r>
+        <w:t>POST</w:t>
+      </w:r>
+      <w:r>
+        <w:rPr>
+          <w:b/>
+        </w:rPr>
+        <w:t xml:space="preserve">    Path: </w:t>
+      </w:r>
+      <w:r>
+        <w:rPr>
+          <w:rFonts w:ascii="Courier New" w:hAnsi="Courier New"/>
+          <w:sz w:val="18"/>
+        </w:rPr>
+        <w:t>/api/company-requests</w:t>
+      </w:r>
+    </w:p>
+    <w:p>
+      <w:r>
+        <w:rPr>
+          <w:b/>
+        </w:rPr>
+        <w:t xml:space="preserve">Auth: </w:t>
+      </w:r>
+      <w:r>
+        <w:rPr>
+          <w:b w:val="0"/>
+        </w:rPr>
+        <w:t>Public — no token required</w:t>
+      </w:r>
+    </w:p>
+    <w:p>
+      <w:r>
+        <w:rPr>
+          <w:b/>
+        </w:rPr>
+        <w:t xml:space="preserve">Description: </w:t>
+      </w:r>
+      <w:r>
+        <w:rPr>
+          <w:b w:val="0"/>
+        </w:rPr>
+        <w:t>Allows a company to submit a join-platform request without being logged in. Input is validated server-side using isValidEmail() and isPlainString() helpers from validators.js. The email is checked against an RFC 5322-lite regex. confirmInfo must be true. On success, a CompanyRequest document is saved with status 'Pending'. Admins review it separately and, upon approval, create a company login via POST /api/admin/create-company. This endpoint does NOT create a company login account.</w:t>
+      </w:r>
+    </w:p>
+    <w:p>
+      <w:r>
+        <w:rPr>
+          <w:b/>
+        </w:rPr>
+        <w:t xml:space="preserve">Request Parameters: </w:t>
+      </w:r>
+      <w:r>
+        <w:rPr>
+          <w:b w:val="0"/>
+        </w:rPr>
+        <w:t>None</w:t>
+      </w:r>
+    </w:p>
+    <w:p>
+      <w:r>
+        <w:rPr>
+          <w:b/>
+          <w:i w:val="0"/>
+        </w:rPr>
+        <w:t>Request Body:</w:t>
+      </w:r>
+    </w:p>
+    <w:p>
+      <w:pPr>
+        <w:ind w:left="432"/>
+      </w:pPr>
+      <w:r>
+        <w:rPr>
+          <w:rFonts w:ascii="Courier New" w:hAnsi="Courier New"/>
+          <w:b/>
+          <w:sz w:val="18"/>
+        </w:rPr>
+        <w:t xml:space="preserve">  companyName</w:t>
+      </w:r>
+      <w:r>
+        <w:t xml:space="preserve"> (String, required) — Max 200 chars</w:t>
+      </w:r>
+    </w:p>
+    <w:p>
+      <w:pPr>
+        <w:ind w:left="432"/>
+      </w:pPr>
+      <w:r>
+        <w:rPr>
+          <w:rFonts w:ascii="Courier New" w:hAnsi="Courier New"/>
+          <w:b/>
+          <w:sz w:val="18"/>
+        </w:rPr>
+        <w:t xml:space="preserve">  industry</w:t>
+      </w:r>
+      <w:r>
+        <w:t xml:space="preserve"> (String, required) — Max 100 chars</w:t>
+      </w:r>
+    </w:p>
+    <w:p>
+      <w:pPr>
+        <w:ind w:left="432"/>
+      </w:pPr>
+      <w:r>
+        <w:rPr>
+          <w:rFonts w:ascii="Courier New" w:hAnsi="Courier New"/>
+          <w:b/>
+          <w:sz w:val="18"/>
+        </w:rPr>
+        <w:t xml:space="preserve">  officialEmail</w:t>
+      </w:r>
+      <w:r>
+        <w:t xml:space="preserve"> (String, required) — Must pass RFC 5322-lite regex; stored lowercase</w:t>
+      </w:r>
+    </w:p>
+    <w:p>
+      <w:pPr>
+        <w:ind w:left="432"/>
+      </w:pPr>
+      <w:r>
+        <w:rPr>
+          <w:rFonts w:ascii="Courier New" w:hAnsi="Courier New"/>
+          <w:b/>
+          <w:sz w:val="18"/>
+        </w:rPr>
+        <w:t xml:space="preserve">  phoneNumber</w:t>
+      </w:r>
+      <w:r>
+        <w:t xml:space="preserve"> (String, required) — Max 20 chars</w:t>
+      </w:r>
+    </w:p>
+    <w:p>
+      <w:pPr>
+        <w:ind w:left="432"/>
+      </w:pPr>
+      <w:r>
+        <w:rPr>
+          <w:rFonts w:ascii="Courier New" w:hAnsi="Courier New"/>
+          <w:b/>
+          <w:sz w:val="18"/>
+        </w:rPr>
+        <w:t xml:space="preserve">  companySize</w:t>
+      </w:r>
+      <w:r>
+        <w:t xml:space="preserve"> (String, required) — e.g. '50-200'. Max 50 chars</w:t>
+      </w:r>
+    </w:p>
+    <w:p>
+      <w:pPr>
+        <w:ind w:left="432"/>
+      </w:pPr>
+      <w:r>
+        <w:rPr>
+          <w:rFonts w:ascii="Courier New" w:hAnsi="Courier New"/>
+          <w:b/>
+          <w:sz w:val="18"/>
+        </w:rPr>
+        <w:t xml:space="preserve">  location</w:t>
+      </w:r>
+      <w:r>
+        <w:t xml:space="preserve"> (String, required) — Max 100 chars</w:t>
+      </w:r>
+    </w:p>
+    <w:p>
+      <w:pPr>
+        <w:ind w:left="432"/>
+      </w:pPr>
+      <w:r>
+        <w:rPr>
+          <w:rFonts w:ascii="Courier New" w:hAnsi="Courier New"/>
+          <w:b/>
+          <w:sz w:val="18"/>
+        </w:rPr>
+        <w:t xml:space="preserve">  contactPerson</w:t>
+      </w:r>
+      <w:r>
+        <w:t xml:space="preserve"> (String, required) — Max 100 chars</w:t>
+      </w:r>
+    </w:p>
+    <w:p>
+      <w:pPr>
+        <w:ind w:left="432"/>
+      </w:pPr>
+      <w:r>
+        <w:rPr>
+          <w:rFonts w:ascii="Courier New" w:hAnsi="Courier New"/>
+          <w:b/>
+          <w:sz w:val="18"/>
+        </w:rPr>
+        <w:t xml:space="preserve">  companyDescription</w:t>
+      </w:r>
+      <w:r>
+        <w:t xml:space="preserve"> (String, required) — Max 2000 chars</w:t>
+      </w:r>
+    </w:p>
+    <w:p>
+      <w:pPr>
+        <w:ind w:left="432"/>
+      </w:pPr>
+      <w:r>
+        <w:rPr>
+          <w:rFonts w:ascii="Courier New" w:hAnsi="Courier New"/>
+          <w:b/>
+          <w:sz w:val="18"/>
+        </w:rPr>
+        <w:t xml:space="preserve">  joinReason</w:t>
+      </w:r>
+      <w:r>
+        <w:t xml:space="preserve"> (String, required) — Max 2000 chars</w:t>
+      </w:r>
+    </w:p>
+    <w:p>
+      <w:pPr>
+        <w:ind w:left="432"/>
+      </w:pPr>
+      <w:r>
+        <w:rPr>
+          <w:rFonts w:ascii="Courier New" w:hAnsi="Courier New"/>
+          <w:b/>
+          <w:sz w:val="18"/>
+        </w:rPr>
+        <w:t xml:space="preserve">  confirmInfo</w:t>
+      </w:r>
+      <w:r>
+        <w:t xml:space="preserve"> (Boolean, required) — Must be true — applicant confirms info is correct</w:t>
+      </w:r>
+    </w:p>
+    <w:p>
+      <w:pPr>
+        <w:ind w:left="432"/>
+      </w:pPr>
+      <w:r>
+        <w:rPr>
+          <w:rFonts w:ascii="Courier New" w:hAnsi="Courier New"/>
+          <w:b/>
+          <w:sz w:val="18"/>
+        </w:rPr>
+        <w:t xml:space="preserve">  website</w:t>
+      </w:r>
+      <w:r>
+        <w:t xml:space="preserve"> (String, optional) — Default: ''</w:t>
+      </w:r>
+    </w:p>
+    <w:p>
+      <w:pPr>
+        <w:ind w:left="432"/>
+      </w:pPr>
+      <w:r>
+        <w:rPr>
+          <w:rFonts w:ascii="Courier New" w:hAnsi="Courier New"/>
+          <w:b/>
+          <w:sz w:val="18"/>
+        </w:rPr>
+        <w:t xml:space="preserve">  foundedYear</w:t>
+      </w:r>
+      <w:r>
+        <w:t xml:space="preserve"> (String, optional) — Max 4 chars</w:t>
+      </w:r>
+    </w:p>
+    <w:p>
+      <w:r>
+        <w:rPr>
+          <w:b/>
+        </w:rPr>
+        <w:t xml:space="preserve">Response (Success): </w:t>
+      </w:r>
+      <w:r>
+        <w:rPr>
+          <w:b w:val="0"/>
+        </w:rPr>
+        <w:t>201 Created — { message: 'Request submitted successfully', request: { id: &lt;ObjectId&gt;, status: 'Pending' } }</w:t>
+      </w:r>
+    </w:p>
+    <w:p>
+      <w:r>
+        <w:rPr>
+          <w:b/>
+        </w:rPr>
+        <w:t xml:space="preserve">Response (Errors): </w:t>
+      </w:r>
+      <w:r>
+        <w:rPr>
+          <w:b w:val="0"/>
+        </w:rPr>
+        <w:t>400 — Missing required fields | 400 — Invalid input format (non-string value) | 400 — Invalid email format | 400 — You must confirm the information is correct | 400 — ValidationError (Mongoose maxlength violations) | 500 — Server error</w:t>
+      </w:r>
+    </w:p>
+    <w:p>
+      <w:r>
+        <w:rPr>
+          <w:b/>
+        </w:rPr>
+        <w:t xml:space="preserve">Sample Call: </w:t>
+      </w:r>
+      <w:r>
+        <w:rPr>
+          <w:rFonts w:ascii="Courier New" w:hAnsi="Courier New"/>
+          <w:sz w:val="16"/>
+        </w:rPr>
+        <w:t>curl -X POST http://localhost:5001/api/company-requests -H "Content-Type: application/json" -d '{"companyName":"Acme","industry":"Technology","officialEmail":"hr@acme.com","phoneNumber":"0501234567","companySize":"50-200","location":"Riyadh","contactPerson":"Mohammed Ali","companyDescription":"Leading tech firm","joinReason":"Find talented interns","confirmInfo":true}'</w:t>
+      </w:r>
+    </w:p>
+    <w:p>
+      <w:r>
+        <w:rPr>
+          <w:color w:val="CCCCCC"/>
+        </w:rPr>
+        <w:t>────────────────────────────────────────────────────────────────────────────────</w:t>
+      </w:r>
+    </w:p>
     <w:p>
       <w:pPr>
         <w:pStyle w:val="Heading2"/>
@@ -4875,6 +5215,279 @@
     </w:p>
     <w:p/>
     <w:p/>
+    <w:p/>
+    <w:p>
+      <w:r>
+        <w:rPr>
+          <w:b/>
+          <w:sz w:val="22"/>
+          <w:u w:val="single"/>
+        </w:rPr>
+        <w:t>Collection 6: companyrequests</w:t>
+      </w:r>
+    </w:p>
+    <w:p>
+      <w:r>
+        <w:rPr>
+          <w:b/>
+          <w:i w:val="0"/>
+        </w:rPr>
+        <w:t>Fields:</w:t>
+      </w:r>
+    </w:p>
+    <w:p>
+      <w:pPr>
+        <w:ind w:left="432"/>
+      </w:pPr>
+      <w:r>
+        <w:rPr>
+          <w:rFonts w:ascii="Courier New" w:hAnsi="Courier New"/>
+          <w:b/>
+          <w:sz w:val="18"/>
+        </w:rPr>
+        <w:t xml:space="preserve">  companyName</w:t>
+      </w:r>
+      <w:r>
+        <w:t>: String — required, max 200</w:t>
+      </w:r>
+    </w:p>
+    <w:p>
+      <w:pPr>
+        <w:ind w:left="432"/>
+      </w:pPr>
+      <w:r>
+        <w:rPr>
+          <w:rFonts w:ascii="Courier New" w:hAnsi="Courier New"/>
+          <w:b/>
+          <w:sz w:val="18"/>
+        </w:rPr>
+        <w:t xml:space="preserve">  industry</w:t>
+      </w:r>
+      <w:r>
+        <w:t>: String — required, max 100</w:t>
+      </w:r>
+    </w:p>
+    <w:p>
+      <w:pPr>
+        <w:ind w:left="432"/>
+      </w:pPr>
+      <w:r>
+        <w:rPr>
+          <w:rFonts w:ascii="Courier New" w:hAnsi="Courier New"/>
+          <w:b/>
+          <w:sz w:val="18"/>
+        </w:rPr>
+        <w:t xml:space="preserve">  officialEmail</w:t>
+      </w:r>
+      <w:r>
+        <w:t>: String — required, lowercase, max 200. Validated against EMAIL_REGEX from validators.js</w:t>
+      </w:r>
+    </w:p>
+    <w:p>
+      <w:pPr>
+        <w:ind w:left="432"/>
+      </w:pPr>
+      <w:r>
+        <w:rPr>
+          <w:rFonts w:ascii="Courier New" w:hAnsi="Courier New"/>
+          <w:b/>
+          <w:sz w:val="18"/>
+        </w:rPr>
+        <w:t xml:space="preserve">  phoneNumber</w:t>
+      </w:r>
+      <w:r>
+        <w:t>: String — required, max 20</w:t>
+      </w:r>
+    </w:p>
+    <w:p>
+      <w:pPr>
+        <w:ind w:left="432"/>
+      </w:pPr>
+      <w:r>
+        <w:rPr>
+          <w:rFonts w:ascii="Courier New" w:hAnsi="Courier New"/>
+          <w:b/>
+          <w:sz w:val="18"/>
+        </w:rPr>
+        <w:t xml:space="preserve">  website</w:t>
+      </w:r>
+      <w:r>
+        <w:t>: String — optional, default: ''</w:t>
+      </w:r>
+    </w:p>
+    <w:p>
+      <w:pPr>
+        <w:ind w:left="432"/>
+      </w:pPr>
+      <w:r>
+        <w:rPr>
+          <w:rFonts w:ascii="Courier New" w:hAnsi="Courier New"/>
+          <w:b/>
+          <w:sz w:val="18"/>
+        </w:rPr>
+        <w:t xml:space="preserve">  companySize</w:t>
+      </w:r>
+      <w:r>
+        <w:t>: String — required, max 50. e.g. '50-200'</w:t>
+      </w:r>
+    </w:p>
+    <w:p>
+      <w:pPr>
+        <w:ind w:left="432"/>
+      </w:pPr>
+      <w:r>
+        <w:rPr>
+          <w:rFonts w:ascii="Courier New" w:hAnsi="Courier New"/>
+          <w:b/>
+          <w:sz w:val="18"/>
+        </w:rPr>
+        <w:t xml:space="preserve">  location</w:t>
+      </w:r>
+      <w:r>
+        <w:t>: String — required, max 100</w:t>
+      </w:r>
+    </w:p>
+    <w:p>
+      <w:pPr>
+        <w:ind w:left="432"/>
+      </w:pPr>
+      <w:r>
+        <w:rPr>
+          <w:rFonts w:ascii="Courier New" w:hAnsi="Courier New"/>
+          <w:b/>
+          <w:sz w:val="18"/>
+        </w:rPr>
+        <w:t xml:space="preserve">  foundedYear</w:t>
+      </w:r>
+      <w:r>
+        <w:t>: String — optional, default: ''. Stored as string, max 4 chars</w:t>
+      </w:r>
+    </w:p>
+    <w:p>
+      <w:pPr>
+        <w:ind w:left="432"/>
+      </w:pPr>
+      <w:r>
+        <w:rPr>
+          <w:rFonts w:ascii="Courier New" w:hAnsi="Courier New"/>
+          <w:b/>
+          <w:sz w:val="18"/>
+        </w:rPr>
+        <w:t xml:space="preserve">  contactPerson</w:t>
+      </w:r>
+      <w:r>
+        <w:t>: String — required, max 100</w:t>
+      </w:r>
+    </w:p>
+    <w:p>
+      <w:pPr>
+        <w:ind w:left="432"/>
+      </w:pPr>
+      <w:r>
+        <w:rPr>
+          <w:rFonts w:ascii="Courier New" w:hAnsi="Courier New"/>
+          <w:b/>
+          <w:sz w:val="18"/>
+        </w:rPr>
+        <w:t xml:space="preserve">  companyDescription</w:t>
+      </w:r>
+      <w:r>
+        <w:t>: String — required, max 2000</w:t>
+      </w:r>
+    </w:p>
+    <w:p>
+      <w:pPr>
+        <w:ind w:left="432"/>
+      </w:pPr>
+      <w:r>
+        <w:rPr>
+          <w:rFonts w:ascii="Courier New" w:hAnsi="Courier New"/>
+          <w:b/>
+          <w:sz w:val="18"/>
+        </w:rPr>
+        <w:t xml:space="preserve">  joinReason</w:t>
+      </w:r>
+      <w:r>
+        <w:t>: String — required, max 2000</w:t>
+      </w:r>
+    </w:p>
+    <w:p>
+      <w:pPr>
+        <w:ind w:left="432"/>
+      </w:pPr>
+      <w:r>
+        <w:rPr>
+          <w:rFonts w:ascii="Courier New" w:hAnsi="Courier New"/>
+          <w:b/>
+          <w:sz w:val="18"/>
+        </w:rPr>
+        <w:t xml:space="preserve">  confirmInfo</w:t>
+      </w:r>
+      <w:r>
+        <w:t>: Boolean — default: false. Must be true for the request to be accepted</w:t>
+      </w:r>
+    </w:p>
+    <w:p>
+      <w:pPr>
+        <w:ind w:left="432"/>
+      </w:pPr>
+      <w:r>
+        <w:rPr>
+          <w:rFonts w:ascii="Courier New" w:hAnsi="Courier New"/>
+          <w:b/>
+          <w:sz w:val="18"/>
+        </w:rPr>
+        <w:t xml:space="preserve">  status</w:t>
+      </w:r>
+      <w:r>
+        <w:t>: String — enum, default: 'Pending'. 'Pending' | 'Review' | 'Approved' | 'Rejected'</w:t>
+      </w:r>
+    </w:p>
+    <w:p>
+      <w:pPr>
+        <w:ind w:left="432"/>
+      </w:pPr>
+      <w:r>
+        <w:rPr>
+          <w:rFonts w:ascii="Courier New" w:hAnsi="Courier New"/>
+          <w:b/>
+          <w:sz w:val="18"/>
+        </w:rPr>
+        <w:t xml:space="preserve">  timestamps</w:t>
+      </w:r>
+      <w:r>
+        <w:t>: auto — . createdAt and updatedAt added by Mongoose</w:t>
+      </w:r>
+    </w:p>
+    <w:p>
+      <w:r>
+        <w:rPr>
+          <w:b/>
+        </w:rPr>
+        <w:t xml:space="preserve">Indexes: </w:t>
+      </w:r>
+      <w:r>
+        <w:rPr>
+          <w:b w:val="0"/>
+        </w:rPr>
+        <w:t>No unique index on officialEmail — multiple requests from the same company are permitted (admin deduplicates during review). Default _id index only.</w:t>
+      </w:r>
+    </w:p>
+    <w:p>
+      <w:r>
+        <w:rPr>
+          <w:b/>
+        </w:rPr>
+        <w:t xml:space="preserve">Relationships: </w:t>
+      </w:r>
+      <w:r>
+        <w:rPr>
+          <w:b w:val="0"/>
+        </w:rPr>
+        <w:t>Stand-alone collection — no ObjectId references to other collections. After admin approval, a company login account is created separately via POST /api/admin/create-company using the data from this request.</w:t>
+      </w:r>
+    </w:p>
+    <w:p/>
     <w:p>
       <w:pPr>
         <w:pStyle w:val="Heading2"/>
@@ -5970,6 +6583,466 @@
       </w:r>
       <w:r>
         <w:t>401 Unauthorized — { message: 'Not authorized, token failed' }. jwt.verify() throws JsonWebTokenError which is caught.</w:t>
+      </w:r>
+    </w:p>
+    <w:p>
+      <w:pPr>
+        <w:ind w:left="288"/>
+      </w:pPr>
+      <w:r>
+        <w:rPr>
+          <w:b/>
+        </w:rPr>
+        <w:t xml:space="preserve">Result: </w:t>
+      </w:r>
+      <w:r>
+        <w:rPr>
+          <w:b/>
+          <w:color w:val="16A34A"/>
+        </w:rPr>
+        <w:t>PASSED</w:t>
+      </w:r>
+    </w:p>
+    <w:p/>
+    <w:p>
+      <w:r>
+        <w:rPr>
+          <w:b/>
+          <w:sz w:val="22"/>
+        </w:rPr>
+        <w:t>Test Case 13: Submit Company Join Request — Valid Data</w:t>
+      </w:r>
+    </w:p>
+    <w:p>
+      <w:pPr>
+        <w:ind w:left="288"/>
+      </w:pPr>
+      <w:r>
+        <w:rPr>
+          <w:b/>
+        </w:rPr>
+        <w:t xml:space="preserve">Objective: </w:t>
+      </w:r>
+      <w:r>
+        <w:t>Verify that a company can submit a platform join request with all required fields and a valid email, and receive a 201 response with status 'Pending'.</w:t>
+      </w:r>
+    </w:p>
+    <w:p>
+      <w:pPr>
+        <w:ind w:left="288"/>
+      </w:pPr>
+      <w:r>
+        <w:rPr>
+          <w:b/>
+        </w:rPr>
+        <w:t xml:space="preserve">Method: </w:t>
+      </w:r>
+      <w:r>
+        <w:rPr>
+          <w:rFonts w:ascii="Courier New" w:hAnsi="Courier New"/>
+          <w:sz w:val="17"/>
+        </w:rPr>
+        <w:t>POST /api/company-requests — companyRequestController.createCompanyRequest()</w:t>
+      </w:r>
+    </w:p>
+    <w:p>
+      <w:pPr>
+        <w:ind w:left="288"/>
+      </w:pPr>
+      <w:r>
+        <w:rPr>
+          <w:b/>
+        </w:rPr>
+        <w:t xml:space="preserve">Input: </w:t>
+      </w:r>
+      <w:r>
+        <w:rPr>
+          <w:rFonts w:ascii="Courier New" w:hAnsi="Courier New"/>
+          <w:sz w:val="17"/>
+        </w:rPr>
+        <w:t>{ companyName:"Acme Corp", industry:"Technology", officialEmail:"hr@acme.com", phoneNumber:"0501234567", companySize:"50-200", location:"Riyadh", contactPerson:"Mohammed Ali", companyDescription:"Leading tech firm.", joinReason:"Find talented interns.", confirmInfo:true }</w:t>
+      </w:r>
+    </w:p>
+    <w:p>
+      <w:pPr>
+        <w:ind w:left="288"/>
+      </w:pPr>
+      <w:r>
+        <w:rPr>
+          <w:b/>
+        </w:rPr>
+        <w:t xml:space="preserve">Expected Output: </w:t>
+      </w:r>
+      <w:r>
+        <w:t>201 Created — { message: 'Request submitted successfully', request: { id: &lt;ObjectId&gt;, status: 'Pending' } }. A CompanyRequest document is persisted in MongoDB.</w:t>
+      </w:r>
+    </w:p>
+    <w:p>
+      <w:pPr>
+        <w:ind w:left="288"/>
+      </w:pPr>
+      <w:r>
+        <w:rPr>
+          <w:b/>
+        </w:rPr>
+        <w:t xml:space="preserve">Result: </w:t>
+      </w:r>
+      <w:r>
+        <w:rPr>
+          <w:b/>
+          <w:color w:val="16A34A"/>
+        </w:rPr>
+        <w:t>PASSED</w:t>
+      </w:r>
+    </w:p>
+    <w:p/>
+    <w:p>
+      <w:r>
+        <w:rPr>
+          <w:b/>
+          <w:sz w:val="22"/>
+        </w:rPr>
+        <w:t>Test Case 14: Company Join Request — Invalid Email Format</w:t>
+      </w:r>
+    </w:p>
+    <w:p>
+      <w:pPr>
+        <w:ind w:left="288"/>
+      </w:pPr>
+      <w:r>
+        <w:rPr>
+          <w:b/>
+        </w:rPr>
+        <w:t xml:space="preserve">Objective: </w:t>
+      </w:r>
+      <w:r>
+        <w:t>Verify that isValidEmail() in validators.js correctly rejects a malformed email address before any DB write occurs.</w:t>
+      </w:r>
+    </w:p>
+    <w:p>
+      <w:pPr>
+        <w:ind w:left="288"/>
+      </w:pPr>
+      <w:r>
+        <w:rPr>
+          <w:b/>
+        </w:rPr>
+        <w:t xml:space="preserve">Method: </w:t>
+      </w:r>
+      <w:r>
+        <w:rPr>
+          <w:rFonts w:ascii="Courier New" w:hAnsi="Courier New"/>
+          <w:sz w:val="17"/>
+        </w:rPr>
+        <w:t>POST /api/company-requests — isValidEmail() in companyRequestController.js</w:t>
+      </w:r>
+    </w:p>
+    <w:p>
+      <w:pPr>
+        <w:ind w:left="288"/>
+      </w:pPr>
+      <w:r>
+        <w:rPr>
+          <w:b/>
+        </w:rPr>
+        <w:t xml:space="preserve">Input: </w:t>
+      </w:r>
+      <w:r>
+        <w:rPr>
+          <w:rFonts w:ascii="Courier New" w:hAnsi="Courier New"/>
+          <w:sz w:val="17"/>
+        </w:rPr>
+        <w:t>Same body as TC13 but officialEmail: "not-an-email"</w:t>
+      </w:r>
+    </w:p>
+    <w:p>
+      <w:pPr>
+        <w:ind w:left="288"/>
+      </w:pPr>
+      <w:r>
+        <w:rPr>
+          <w:b/>
+        </w:rPr>
+        <w:t xml:space="preserve">Expected Output: </w:t>
+      </w:r>
+      <w:r>
+        <w:t>400 Bad Request — { message: 'Invalid email format' }. No document written to DB.</w:t>
+      </w:r>
+    </w:p>
+    <w:p>
+      <w:pPr>
+        <w:ind w:left="288"/>
+      </w:pPr>
+      <w:r>
+        <w:rPr>
+          <w:b/>
+        </w:rPr>
+        <w:t xml:space="preserve">Result: </w:t>
+      </w:r>
+      <w:r>
+        <w:rPr>
+          <w:b/>
+          <w:color w:val="16A34A"/>
+        </w:rPr>
+        <w:t>PASSED</w:t>
+      </w:r>
+    </w:p>
+    <w:p/>
+    <w:p>
+      <w:r>
+        <w:rPr>
+          <w:b/>
+          <w:sz w:val="22"/>
+        </w:rPr>
+        <w:t>Test Case 15: Company Join Request — confirmInfo is false</w:t>
+      </w:r>
+    </w:p>
+    <w:p>
+      <w:pPr>
+        <w:ind w:left="288"/>
+      </w:pPr>
+      <w:r>
+        <w:rPr>
+          <w:b/>
+        </w:rPr>
+        <w:t xml:space="preserve">Objective: </w:t>
+      </w:r>
+      <w:r>
+        <w:t>Verify that the controller rejects a request when the company has not confirmed their information.</w:t>
+      </w:r>
+    </w:p>
+    <w:p>
+      <w:pPr>
+        <w:ind w:left="288"/>
+      </w:pPr>
+      <w:r>
+        <w:rPr>
+          <w:b/>
+        </w:rPr>
+        <w:t xml:space="preserve">Method: </w:t>
+      </w:r>
+      <w:r>
+        <w:rPr>
+          <w:rFonts w:ascii="Courier New" w:hAnsi="Courier New"/>
+          <w:sz w:val="17"/>
+        </w:rPr>
+        <w:t>POST /api/company-requests — confirmInfo check in companyRequestController.js</w:t>
+      </w:r>
+    </w:p>
+    <w:p>
+      <w:pPr>
+        <w:ind w:left="288"/>
+      </w:pPr>
+      <w:r>
+        <w:rPr>
+          <w:b/>
+        </w:rPr>
+        <w:t xml:space="preserve">Input: </w:t>
+      </w:r>
+      <w:r>
+        <w:rPr>
+          <w:rFonts w:ascii="Courier New" w:hAnsi="Courier New"/>
+          <w:sz w:val="17"/>
+        </w:rPr>
+        <w:t>Same body as TC13 but confirmInfo: false</w:t>
+      </w:r>
+    </w:p>
+    <w:p>
+      <w:pPr>
+        <w:ind w:left="288"/>
+      </w:pPr>
+      <w:r>
+        <w:rPr>
+          <w:b/>
+        </w:rPr>
+        <w:t xml:space="preserve">Expected Output: </w:t>
+      </w:r>
+      <w:r>
+        <w:t>400 Bad Request — { message: 'You must confirm the information is correct' }.</w:t>
+      </w:r>
+    </w:p>
+    <w:p>
+      <w:pPr>
+        <w:ind w:left="288"/>
+      </w:pPr>
+      <w:r>
+        <w:rPr>
+          <w:b/>
+        </w:rPr>
+        <w:t xml:space="preserve">Result: </w:t>
+      </w:r>
+      <w:r>
+        <w:rPr>
+          <w:b/>
+          <w:color w:val="16A34A"/>
+        </w:rPr>
+        <w:t>PASSED</w:t>
+      </w:r>
+    </w:p>
+    <w:p/>
+    <w:p>
+      <w:r>
+        <w:rPr>
+          <w:b/>
+          <w:sz w:val="22"/>
+        </w:rPr>
+        <w:t>Test Case 16: Content-Type Enforcement — Wrong MIME Type on Write</w:t>
+      </w:r>
+    </w:p>
+    <w:p>
+      <w:pPr>
+        <w:ind w:left="288"/>
+      </w:pPr>
+      <w:r>
+        <w:rPr>
+          <w:b/>
+        </w:rPr>
+        <w:t xml:space="preserve">Objective: </w:t>
+      </w:r>
+      <w:r>
+        <w:t>Verify the new Content-Type middleware in server.js returns 415 for POST/PUT/PATCH requests that send a non-JSON body.</w:t>
+      </w:r>
+    </w:p>
+    <w:p>
+      <w:pPr>
+        <w:ind w:left="288"/>
+      </w:pPr>
+      <w:r>
+        <w:rPr>
+          <w:b/>
+        </w:rPr>
+        <w:t xml:space="preserve">Method: </w:t>
+      </w:r>
+      <w:r>
+        <w:rPr>
+          <w:rFonts w:ascii="Courier New" w:hAnsi="Courier New"/>
+          <w:sz w:val="17"/>
+        </w:rPr>
+        <w:t>POST /api/auth/student/login — Content-Type enforcement middleware in server.js</w:t>
+      </w:r>
+    </w:p>
+    <w:p>
+      <w:pPr>
+        <w:ind w:left="288"/>
+      </w:pPr>
+      <w:r>
+        <w:rPr>
+          <w:b/>
+        </w:rPr>
+        <w:t xml:space="preserve">Input: </w:t>
+      </w:r>
+      <w:r>
+        <w:rPr>
+          <w:rFonts w:ascii="Courier New" w:hAnsi="Courier New"/>
+          <w:sz w:val="17"/>
+        </w:rPr>
+        <w:t>curl -X POST http://localhost:5001/api/auth/student/login -H "Content-Type: text/plain" -d '{"email":"a@b.com","password":"pass"}'</w:t>
+      </w:r>
+    </w:p>
+    <w:p>
+      <w:pPr>
+        <w:ind w:left="288"/>
+      </w:pPr>
+      <w:r>
+        <w:rPr>
+          <w:b/>
+        </w:rPr>
+        <w:t xml:space="preserve">Expected Output: </w:t>
+      </w:r>
+      <w:r>
+        <w:t>415 Unsupported Media Type — { message: "Unsupported Content-Type. Expected application/json" }.</w:t>
+      </w:r>
+    </w:p>
+    <w:p>
+      <w:pPr>
+        <w:ind w:left="288"/>
+      </w:pPr>
+      <w:r>
+        <w:rPr>
+          <w:b/>
+        </w:rPr>
+        <w:t xml:space="preserve">Result: </w:t>
+      </w:r>
+      <w:r>
+        <w:rPr>
+          <w:b/>
+          <w:color w:val="16A34A"/>
+        </w:rPr>
+        <w:t>PASSED</w:t>
+      </w:r>
+    </w:p>
+    <w:p/>
+    <w:p>
+      <w:r>
+        <w:rPr>
+          <w:b/>
+          <w:sz w:val="22"/>
+        </w:rPr>
+        <w:t>Test Case 17: Unknown API Route Returns JSON 404</w:t>
+      </w:r>
+    </w:p>
+    <w:p>
+      <w:pPr>
+        <w:ind w:left="288"/>
+      </w:pPr>
+      <w:r>
+        <w:rPr>
+          <w:b/>
+        </w:rPr>
+        <w:t xml:space="preserve">Objective: </w:t>
+      </w:r>
+      <w:r>
+        <w:t>Verify the /api catch-all 404 handler in server.js returns a clean JSON error (not an HTML Express error page) for undefined routes.</w:t>
+      </w:r>
+    </w:p>
+    <w:p>
+      <w:pPr>
+        <w:ind w:left="288"/>
+      </w:pPr>
+      <w:r>
+        <w:rPr>
+          <w:b/>
+        </w:rPr>
+        <w:t xml:space="preserve">Method: </w:t>
+      </w:r>
+      <w:r>
+        <w:rPr>
+          <w:rFonts w:ascii="Courier New" w:hAnsi="Courier New"/>
+          <w:sz w:val="17"/>
+        </w:rPr>
+        <w:t>GET /api/nonexistent — 404 catch-all middleware in server.js</w:t>
+      </w:r>
+    </w:p>
+    <w:p>
+      <w:pPr>
+        <w:ind w:left="288"/>
+      </w:pPr>
+      <w:r>
+        <w:rPr>
+          <w:b/>
+        </w:rPr>
+        <w:t xml:space="preserve">Input: </w:t>
+      </w:r>
+      <w:r>
+        <w:rPr>
+          <w:rFonts w:ascii="Courier New" w:hAnsi="Courier New"/>
+          <w:sz w:val="17"/>
+        </w:rPr>
+        <w:t>curl http://localhost:5001/api/nonexistent</w:t>
+      </w:r>
+    </w:p>
+    <w:p>
+      <w:pPr>
+        <w:ind w:left="288"/>
+      </w:pPr>
+      <w:r>
+        <w:rPr>
+          <w:b/>
+        </w:rPr>
+        <w:t xml:space="preserve">Expected Output: </w:t>
+      </w:r>
+      <w:r>
+        <w:t>404 Not Found — { message: "Route not found" }. Response Content-Type must be application/json.</w:t>
       </w:r>
     </w:p>
     <w:p>

</xml_diff>